<commit_message>
Fix speaker name Kristoff→Christoph Hellwig; add FIEMAP debate analysis
- Corrected Christoph Hellwig's name (auto-caption rendered it as "Kristoff")
  in all 4 reports (EN/KO × minimal/rich), analysis docs, and facts.json
- Added separate technical analysis report on the FIEMAP debate:
  outputs/reports/snia-sdc-storageai-aisio-2026.fiemap-debate.ko.md
  Covers: TOCTOU race in FS_IOC_FIEMAP, per-filesystem risks (XFS/ext4/btrfs),
  why EBPF mitigation is insufficient, pNFS block layout (RFC 5663) as the
  correct solution, and assessment of both sides' positions
- Regenerated PDF and DOCX for all updated reports
</commit_message>
<xml_diff>
--- a/outputs/reports/snia-sdc-storageai-aisio-2026.minimal.docx
+++ b/outputs/reports/snia-sdc-storageai-aisio-2026.minimal.docx
@@ -251,7 +251,7 @@
         <w:t xml:space="preserve"> </w:t>
       </w:r>
       <w:r>
-        <w:t xml:space="preserve">- Kristoff (audience member who objected to the F_MAP_AP approach during the talk)</w:t>
+        <w:t xml:space="preserve">- Christoph Hellwig (audience member who objected to the F_MAP_AP approach during the talk)</w:t>
       </w:r>
     </w:p>
     <w:p>
@@ -653,7 +653,7 @@
         <w:t xml:space="preserve"> </w:t>
       </w:r>
       <w:r>
-        <w:t xml:space="preserve">— Kristoff</w:t>
+        <w:t xml:space="preserve">— Christoph Hellwig</w:t>
       </w:r>
     </w:p>
     <w:p>
@@ -667,7 +667,7 @@
         <w:t xml:space="preserve"> </w:t>
       </w:r>
       <w:r>
-        <w:t xml:space="preserve">— Kristoff</w:t>
+        <w:t xml:space="preserve">— Christoph Hellwig</w:t>
       </w:r>
     </w:p>
     <w:bookmarkEnd w:id="24"/>

</xml_diff>